<commit_message>
Record that only the sales order stores the purchase-order number.
Sales order 6323 has customer reference 4500002165. Purchase order 4500002165 does not store sales order 6323.

Co-authored-by: aleo25672 <aleo25672@users.noreply.github.com>
</commit_message>
<xml_diff>
--- a/docs/INTERCOMPANY_RESALE.docx
+++ b/docs/INTERCOMPANY_RESALE.docx
@@ -7734,7 +7734,7 @@
           <w:color w:val="1A1A1A"/>
           <w:sz w:val="22"/>
         </w:rPr>
-        <w:t>Purchase order 4500002165 uses purchasing organization 1010, purchasing group 001, company code 1010, currency EUR, and plant 1010. The header exchange rate is 1.00000 because the document currency and the company currency are both EUR. The order reference is sales order 6323. The sales order was released in credit control area 1000 before the delivery.</w:t>
+        <w:t>Purchase order 4500002165 uses purchasing organization 1010, purchasing group 001, company code 1010, currency EUR, and plant 1010. The header exchange rate is 1.00000 because the document currency and the company currency are both EUR. The sales order stores purchase order 4500002165 as its customer reference. The purchase order does not store sales order 6323. The sales order was released in credit control area 1000 before the delivery.</w:t>
       </w:r>
     </w:p>
     <w:p>
@@ -10858,7 +10858,7 @@
                 <w:color w:val="1A1A1A"/>
                 <w:sz w:val="16"/>
               </w:rPr>
-              <w:t>Reference 6323 on the purchase order</w:t>
+              <w:t>Customer reference on the sales order is purchase order 4500002165</w:t>
             </w:r>
           </w:p>
         </w:tc>

</xml_diff>

<commit_message>
Document how the intercompany plant and company partners were identified.
BP1710 is the vendor for plant 1710. Vendor 0017401710 represents company 1710. Customer 10401010 represents company 1010, and customer 10411010 represents plant 1010.

Co-authored-by: aleo25672 <aleo25672@users.noreply.github.com>
</commit_message>
<xml_diff>
--- a/docs/INTERCOMPANY_RESALE.docx
+++ b/docs/INTERCOMPANY_RESALE.docx
@@ -598,6 +598,628 @@
       <w:pPr>
         <w:spacing w:after="120"/>
       </w:pPr>
+    </w:p>
+    <w:p>
+      <w:pPr>
+        <w:pStyle w:val="Heading1"/>
+      </w:pPr>
+      <w:r>
+        <w:t>How the intercompany partners were identified</w:t>
+      </w:r>
+    </w:p>
+    <w:p>
+      <w:pPr>
+        <w:spacing w:after="160" w:before="0" w:line="259" w:lineRule="auto"/>
+      </w:pPr>
+      <w:r>
+        <w:rPr>
+          <w:rFonts w:ascii="Calibri" w:hAnsi="Calibri" w:eastAsia="Calibri"/>
+          <w:b w:val="0"/>
+          <w:color w:val="1A1A1A"/>
+          <w:sz w:val="22"/>
+        </w:rPr>
+        <w:t>Four business partners appear in these cases. Two of them represent a plant. Two of them represent a company code. The number used on a purchase order is not always the number on the posted invoice.</w:t>
+      </w:r>
+    </w:p>
+    <w:tbl>
+      <w:tblPr>
+        <w:tblStyle w:val="TableGrid"/>
+        <w:tblW w:type="auto" w:w="0"/>
+        <w:jc w:val="center"/>
+        <w:tblLayout w:type="autofit"/>
+        <w:tblLook w:firstColumn="1" w:firstRow="1" w:lastColumn="0" w:lastRow="0" w:noHBand="0" w:noVBand="1" w:val="04A0"/>
+      </w:tblPr>
+      <w:tblGrid>
+        <w:gridCol w:w="2606"/>
+        <w:gridCol w:w="2606"/>
+        <w:gridCol w:w="2606"/>
+        <w:gridCol w:w="2606"/>
+      </w:tblGrid>
+      <w:tr>
+        <w:trPr>
+          <w:tblHeader/>
+          <w:cantSplit/>
+        </w:trPr>
+        <w:tc>
+          <w:tcPr>
+            <w:tcW w:type="dxa" w:w="2606"/>
+            <w:shd w:val="clear" w:color="auto" w:fill="1F4E79"/>
+            <w:tcMar>
+              <w:top w:w="60" w:type="dxa"/>
+              <w:left w:w="60" w:type="dxa"/>
+              <w:bottom w:w="60" w:type="dxa"/>
+              <w:right w:w="60" w:type="dxa"/>
+            </w:tcMar>
+          </w:tcPr>
+          <w:p>
+            <w:pPr>
+              <w:spacing w:before="20" w:after="20"/>
+            </w:pPr>
+            <w:r/>
+            <w:r>
+              <w:rPr>
+                <w:rFonts w:ascii="Calibri" w:hAnsi="Calibri" w:eastAsia="Calibri"/>
+                <w:b/>
+                <w:color w:val="FFFFFF"/>
+                <w:sz w:val="16"/>
+              </w:rPr>
+              <w:t>Number</w:t>
+            </w:r>
+          </w:p>
+        </w:tc>
+        <w:tc>
+          <w:tcPr>
+            <w:tcW w:type="dxa" w:w="2606"/>
+            <w:shd w:val="clear" w:color="auto" w:fill="1F4E79"/>
+            <w:tcMar>
+              <w:top w:w="60" w:type="dxa"/>
+              <w:left w:w="60" w:type="dxa"/>
+              <w:bottom w:w="60" w:type="dxa"/>
+              <w:right w:w="60" w:type="dxa"/>
+            </w:tcMar>
+          </w:tcPr>
+          <w:p>
+            <w:pPr>
+              <w:spacing w:before="20" w:after="20"/>
+            </w:pPr>
+            <w:r/>
+            <w:r>
+              <w:rPr>
+                <w:rFonts w:ascii="Calibri" w:hAnsi="Calibri" w:eastAsia="Calibri"/>
+                <w:b/>
+                <w:color w:val="FFFFFF"/>
+                <w:sz w:val="16"/>
+              </w:rPr>
+              <w:t>Name</w:t>
+            </w:r>
+          </w:p>
+        </w:tc>
+        <w:tc>
+          <w:tcPr>
+            <w:tcW w:type="dxa" w:w="2606"/>
+            <w:shd w:val="clear" w:color="auto" w:fill="1F4E79"/>
+            <w:tcMar>
+              <w:top w:w="60" w:type="dxa"/>
+              <w:left w:w="60" w:type="dxa"/>
+              <w:bottom w:w="60" w:type="dxa"/>
+              <w:right w:w="60" w:type="dxa"/>
+            </w:tcMar>
+          </w:tcPr>
+          <w:p>
+            <w:pPr>
+              <w:spacing w:before="20" w:after="20"/>
+            </w:pPr>
+            <w:r/>
+            <w:r>
+              <w:rPr>
+                <w:rFonts w:ascii="Calibri" w:hAnsi="Calibri" w:eastAsia="Calibri"/>
+                <w:b/>
+                <w:color w:val="FFFFFF"/>
+                <w:sz w:val="16"/>
+              </w:rPr>
+              <w:t>What it represents</w:t>
+            </w:r>
+          </w:p>
+        </w:tc>
+        <w:tc>
+          <w:tcPr>
+            <w:tcW w:type="dxa" w:w="2606"/>
+            <w:shd w:val="clear" w:color="auto" w:fill="1F4E79"/>
+            <w:tcMar>
+              <w:top w:w="60" w:type="dxa"/>
+              <w:left w:w="60" w:type="dxa"/>
+              <w:bottom w:w="60" w:type="dxa"/>
+              <w:right w:w="60" w:type="dxa"/>
+            </w:tcMar>
+          </w:tcPr>
+          <w:p>
+            <w:pPr>
+              <w:spacing w:before="20" w:after="20"/>
+            </w:pPr>
+            <w:r/>
+            <w:r>
+              <w:rPr>
+                <w:rFonts w:ascii="Calibri" w:hAnsi="Calibri" w:eastAsia="Calibri"/>
+                <w:b/>
+                <w:color w:val="FFFFFF"/>
+                <w:sz w:val="16"/>
+              </w:rPr>
+              <w:t>How it was identified</w:t>
+            </w:r>
+          </w:p>
+        </w:tc>
+      </w:tr>
+      <w:tr>
+        <w:trPr>
+          <w:cantSplit/>
+        </w:trPr>
+        <w:tc>
+          <w:tcPr>
+            <w:tcW w:type="dxa" w:w="2606"/>
+            <w:shd w:val="clear" w:color="auto" w:fill="FFFFFF"/>
+            <w:tcMar>
+              <w:top w:w="60" w:type="dxa"/>
+              <w:left w:w="60" w:type="dxa"/>
+              <w:bottom w:w="60" w:type="dxa"/>
+              <w:right w:w="60" w:type="dxa"/>
+            </w:tcMar>
+          </w:tcPr>
+          <w:p>
+            <w:pPr>
+              <w:spacing w:before="20" w:after="20"/>
+            </w:pPr>
+            <w:r/>
+            <w:r>
+              <w:rPr>
+                <w:rFonts w:ascii="Calibri" w:hAnsi="Calibri" w:eastAsia="Calibri"/>
+                <w:b w:val="0"/>
+                <w:color w:val="1A1A1A"/>
+                <w:sz w:val="16"/>
+              </w:rPr>
+              <w:t>BP1710</w:t>
+            </w:r>
+          </w:p>
+        </w:tc>
+        <w:tc>
+          <w:tcPr>
+            <w:tcW w:type="dxa" w:w="2606"/>
+            <w:shd w:val="clear" w:color="auto" w:fill="FFFFFF"/>
+            <w:tcMar>
+              <w:top w:w="60" w:type="dxa"/>
+              <w:left w:w="60" w:type="dxa"/>
+              <w:bottom w:w="60" w:type="dxa"/>
+              <w:right w:w="60" w:type="dxa"/>
+            </w:tcMar>
+          </w:tcPr>
+          <w:p>
+            <w:pPr>
+              <w:spacing w:before="20" w:after="20"/>
+            </w:pPr>
+            <w:r/>
+            <w:r>
+              <w:rPr>
+                <w:rFonts w:ascii="Calibri" w:hAnsi="Calibri" w:eastAsia="Calibri"/>
+                <w:b w:val="0"/>
+                <w:color w:val="1A1A1A"/>
+                <w:sz w:val="16"/>
+              </w:rPr>
+              <w:t>Plant 1, Palo Alto</w:t>
+            </w:r>
+          </w:p>
+        </w:tc>
+        <w:tc>
+          <w:tcPr>
+            <w:tcW w:type="dxa" w:w="2606"/>
+            <w:shd w:val="clear" w:color="auto" w:fill="FFFFFF"/>
+            <w:tcMar>
+              <w:top w:w="60" w:type="dxa"/>
+              <w:left w:w="60" w:type="dxa"/>
+              <w:bottom w:w="60" w:type="dxa"/>
+              <w:right w:w="60" w:type="dxa"/>
+            </w:tcMar>
+          </w:tcPr>
+          <w:p>
+            <w:pPr>
+              <w:spacing w:before="20" w:after="20"/>
+            </w:pPr>
+            <w:r/>
+            <w:r>
+              <w:rPr>
+                <w:rFonts w:ascii="Calibri" w:hAnsi="Calibri" w:eastAsia="Calibri"/>
+                <w:b w:val="0"/>
+                <w:color w:val="1A1A1A"/>
+                <w:sz w:val="16"/>
+              </w:rPr>
+              <w:t>Plant 1710, as a vendor</w:t>
+            </w:r>
+          </w:p>
+        </w:tc>
+        <w:tc>
+          <w:tcPr>
+            <w:tcW w:type="dxa" w:w="2606"/>
+            <w:shd w:val="clear" w:color="auto" w:fill="FFFFFF"/>
+            <w:tcMar>
+              <w:top w:w="60" w:type="dxa"/>
+              <w:left w:w="60" w:type="dxa"/>
+              <w:bottom w:w="60" w:type="dxa"/>
+              <w:right w:w="60" w:type="dxa"/>
+            </w:tcMar>
+          </w:tcPr>
+          <w:p>
+            <w:pPr>
+              <w:spacing w:before="20" w:after="20"/>
+            </w:pPr>
+            <w:r/>
+            <w:r>
+              <w:rPr>
+                <w:rFonts w:ascii="Calibri" w:hAnsi="Calibri" w:eastAsia="Calibri"/>
+                <w:b w:val="0"/>
+                <w:color w:val="1A1A1A"/>
+                <w:sz w:val="16"/>
+              </w:rPr>
+              <w:t>Supplier field Plant is 1710. The extract field SUPPLIERPLANT is 1710. Company code 1010 and purchasing organization 1010 are maintained, so company 1010 can order from this plant.</w:t>
+            </w:r>
+          </w:p>
+        </w:tc>
+      </w:tr>
+      <w:tr>
+        <w:trPr>
+          <w:cantSplit/>
+        </w:trPr>
+        <w:tc>
+          <w:tcPr>
+            <w:tcW w:type="dxa" w:w="2606"/>
+            <w:shd w:val="clear" w:color="auto" w:fill="F3F6F9"/>
+            <w:tcMar>
+              <w:top w:w="60" w:type="dxa"/>
+              <w:left w:w="60" w:type="dxa"/>
+              <w:bottom w:w="60" w:type="dxa"/>
+              <w:right w:w="60" w:type="dxa"/>
+            </w:tcMar>
+          </w:tcPr>
+          <w:p>
+            <w:pPr>
+              <w:spacing w:before="20" w:after="20"/>
+            </w:pPr>
+            <w:r/>
+            <w:r>
+              <w:rPr>
+                <w:rFonts w:ascii="Calibri" w:hAnsi="Calibri" w:eastAsia="Calibri"/>
+                <w:b w:val="0"/>
+                <w:color w:val="1A1A1A"/>
+                <w:sz w:val="16"/>
+              </w:rPr>
+              <w:t>0017401710</w:t>
+            </w:r>
+          </w:p>
+        </w:tc>
+        <w:tc>
+          <w:tcPr>
+            <w:tcW w:type="dxa" w:w="2606"/>
+            <w:shd w:val="clear" w:color="auto" w:fill="F3F6F9"/>
+            <w:tcMar>
+              <w:top w:w="60" w:type="dxa"/>
+              <w:left w:w="60" w:type="dxa"/>
+              <w:bottom w:w="60" w:type="dxa"/>
+              <w:right w:w="60" w:type="dxa"/>
+            </w:tcMar>
+          </w:tcPr>
+          <w:p>
+            <w:pPr>
+              <w:spacing w:before="20" w:after="20"/>
+            </w:pPr>
+            <w:r/>
+            <w:r>
+              <w:rPr>
+                <w:rFonts w:ascii="Calibri" w:hAnsi="Calibri" w:eastAsia="Calibri"/>
+                <w:b w:val="0"/>
+                <w:color w:val="1A1A1A"/>
+                <w:sz w:val="16"/>
+              </w:rPr>
+              <w:t>SAP SE</w:t>
+            </w:r>
+          </w:p>
+        </w:tc>
+        <w:tc>
+          <w:tcPr>
+            <w:tcW w:type="dxa" w:w="2606"/>
+            <w:shd w:val="clear" w:color="auto" w:fill="F3F6F9"/>
+            <w:tcMar>
+              <w:top w:w="60" w:type="dxa"/>
+              <w:left w:w="60" w:type="dxa"/>
+              <w:bottom w:w="60" w:type="dxa"/>
+              <w:right w:w="60" w:type="dxa"/>
+            </w:tcMar>
+          </w:tcPr>
+          <w:p>
+            <w:pPr>
+              <w:spacing w:before="20" w:after="20"/>
+            </w:pPr>
+            <w:r/>
+            <w:r>
+              <w:rPr>
+                <w:rFonts w:ascii="Calibri" w:hAnsi="Calibri" w:eastAsia="Calibri"/>
+                <w:b w:val="0"/>
+                <w:color w:val="1A1A1A"/>
+                <w:sz w:val="16"/>
+              </w:rPr>
+              <w:t>Company code 1710, as a vendor</w:t>
+            </w:r>
+          </w:p>
+        </w:tc>
+        <w:tc>
+          <w:tcPr>
+            <w:tcW w:type="dxa" w:w="2606"/>
+            <w:shd w:val="clear" w:color="auto" w:fill="F3F6F9"/>
+            <w:tcMar>
+              <w:top w:w="60" w:type="dxa"/>
+              <w:left w:w="60" w:type="dxa"/>
+              <w:bottom w:w="60" w:type="dxa"/>
+              <w:right w:w="60" w:type="dxa"/>
+            </w:tcMar>
+          </w:tcPr>
+          <w:p>
+            <w:pPr>
+              <w:spacing w:before="20" w:after="20"/>
+            </w:pPr>
+            <w:r/>
+            <w:r>
+              <w:rPr>
+                <w:rFonts w:ascii="Calibri" w:hAnsi="Calibri" w:eastAsia="Calibri"/>
+                <w:b w:val="0"/>
+                <w:color w:val="1A1A1A"/>
+                <w:sz w:val="16"/>
+              </w:rPr>
+              <w:t>Search term COMP1710. Address 3475 Deer Creek, Palo Alto. Vendor invoice 5100001607 posted to this number, although the purchase order was entered with BP1710.</w:t>
+            </w:r>
+          </w:p>
+        </w:tc>
+      </w:tr>
+      <w:tr>
+        <w:trPr>
+          <w:cantSplit/>
+        </w:trPr>
+        <w:tc>
+          <w:tcPr>
+            <w:tcW w:type="dxa" w:w="2606"/>
+            <w:shd w:val="clear" w:color="auto" w:fill="FFFFFF"/>
+            <w:tcMar>
+              <w:top w:w="60" w:type="dxa"/>
+              <w:left w:w="60" w:type="dxa"/>
+              <w:bottom w:w="60" w:type="dxa"/>
+              <w:right w:w="60" w:type="dxa"/>
+            </w:tcMar>
+          </w:tcPr>
+          <w:p>
+            <w:pPr>
+              <w:spacing w:before="20" w:after="20"/>
+            </w:pPr>
+            <w:r/>
+            <w:r>
+              <w:rPr>
+                <w:rFonts w:ascii="Calibri" w:hAnsi="Calibri" w:eastAsia="Calibri"/>
+                <w:b w:val="0"/>
+                <w:color w:val="1A1A1A"/>
+                <w:sz w:val="16"/>
+              </w:rPr>
+              <w:t>10401010</w:t>
+            </w:r>
+          </w:p>
+        </w:tc>
+        <w:tc>
+          <w:tcPr>
+            <w:tcW w:type="dxa" w:w="2606"/>
+            <w:shd w:val="clear" w:color="auto" w:fill="FFFFFF"/>
+            <w:tcMar>
+              <w:top w:w="60" w:type="dxa"/>
+              <w:left w:w="60" w:type="dxa"/>
+              <w:bottom w:w="60" w:type="dxa"/>
+              <w:right w:w="60" w:type="dxa"/>
+            </w:tcMar>
+          </w:tcPr>
+          <w:p>
+            <w:pPr>
+              <w:spacing w:before="20" w:after="20"/>
+            </w:pPr>
+            <w:r/>
+            <w:r>
+              <w:rPr>
+                <w:rFonts w:ascii="Calibri" w:hAnsi="Calibri" w:eastAsia="Calibri"/>
+                <w:b w:val="0"/>
+                <w:color w:val="1A1A1A"/>
+                <w:sz w:val="16"/>
+              </w:rPr>
+              <w:t>Buchungskreis 1010 als Geschäftspartner</w:t>
+            </w:r>
+          </w:p>
+        </w:tc>
+        <w:tc>
+          <w:tcPr>
+            <w:tcW w:type="dxa" w:w="2606"/>
+            <w:shd w:val="clear" w:color="auto" w:fill="FFFFFF"/>
+            <w:tcMar>
+              <w:top w:w="60" w:type="dxa"/>
+              <w:left w:w="60" w:type="dxa"/>
+              <w:bottom w:w="60" w:type="dxa"/>
+              <w:right w:w="60" w:type="dxa"/>
+            </w:tcMar>
+          </w:tcPr>
+          <w:p>
+            <w:pPr>
+              <w:spacing w:before="20" w:after="20"/>
+            </w:pPr>
+            <w:r/>
+            <w:r>
+              <w:rPr>
+                <w:rFonts w:ascii="Calibri" w:hAnsi="Calibri" w:eastAsia="Calibri"/>
+                <w:b w:val="0"/>
+                <w:color w:val="1A1A1A"/>
+                <w:sz w:val="16"/>
+              </w:rPr>
+              <w:t>Company code 1010, as a customer</w:t>
+            </w:r>
+          </w:p>
+        </w:tc>
+        <w:tc>
+          <w:tcPr>
+            <w:tcW w:type="dxa" w:w="2606"/>
+            <w:shd w:val="clear" w:color="auto" w:fill="FFFFFF"/>
+            <w:tcMar>
+              <w:top w:w="60" w:type="dxa"/>
+              <w:left w:w="60" w:type="dxa"/>
+              <w:bottom w:w="60" w:type="dxa"/>
+              <w:right w:w="60" w:type="dxa"/>
+            </w:tcMar>
+          </w:tcPr>
+          <w:p>
+            <w:pPr>
+              <w:spacing w:before="20" w:after="20"/>
+            </w:pPr>
+            <w:r/>
+            <w:r>
+              <w:rPr>
+                <w:rFonts w:ascii="Calibri" w:hAnsi="Calibri" w:eastAsia="Calibri"/>
+                <w:b w:val="0"/>
+                <w:color w:val="1A1A1A"/>
+                <w:sz w:val="16"/>
+              </w:rPr>
+              <w:t>The name means company code 1010 as business partner. Country DE, Walldorf, trading partner 1010. Billing document 90005786 uses this payer.</w:t>
+            </w:r>
+          </w:p>
+        </w:tc>
+      </w:tr>
+      <w:tr>
+        <w:trPr>
+          <w:cantSplit/>
+        </w:trPr>
+        <w:tc>
+          <w:tcPr>
+            <w:tcW w:type="dxa" w:w="2606"/>
+            <w:shd w:val="clear" w:color="auto" w:fill="F3F6F9"/>
+            <w:tcMar>
+              <w:top w:w="60" w:type="dxa"/>
+              <w:left w:w="60" w:type="dxa"/>
+              <w:bottom w:w="60" w:type="dxa"/>
+              <w:right w:w="60" w:type="dxa"/>
+            </w:tcMar>
+          </w:tcPr>
+          <w:p>
+            <w:pPr>
+              <w:spacing w:before="20" w:after="20"/>
+            </w:pPr>
+            <w:r/>
+            <w:r>
+              <w:rPr>
+                <w:rFonts w:ascii="Calibri" w:hAnsi="Calibri" w:eastAsia="Calibri"/>
+                <w:b w:val="0"/>
+                <w:color w:val="1A1A1A"/>
+                <w:sz w:val="16"/>
+              </w:rPr>
+              <w:t>10411010</w:t>
+            </w:r>
+          </w:p>
+        </w:tc>
+        <w:tc>
+          <w:tcPr>
+            <w:tcW w:type="dxa" w:w="2606"/>
+            <w:shd w:val="clear" w:color="auto" w:fill="F3F6F9"/>
+            <w:tcMar>
+              <w:top w:w="60" w:type="dxa"/>
+              <w:left w:w="60" w:type="dxa"/>
+              <w:bottom w:w="60" w:type="dxa"/>
+              <w:right w:w="60" w:type="dxa"/>
+            </w:tcMar>
+          </w:tcPr>
+          <w:p>
+            <w:pPr>
+              <w:spacing w:before="20" w:after="20"/>
+            </w:pPr>
+            <w:r/>
+            <w:r>
+              <w:rPr>
+                <w:rFonts w:ascii="Calibri" w:hAnsi="Calibri" w:eastAsia="Calibri"/>
+                <w:b w:val="0"/>
+                <w:color w:val="1A1A1A"/>
+                <w:sz w:val="16"/>
+              </w:rPr>
+              <w:t>Werk 1010 als Geschäftspartner</w:t>
+            </w:r>
+          </w:p>
+        </w:tc>
+        <w:tc>
+          <w:tcPr>
+            <w:tcW w:type="dxa" w:w="2606"/>
+            <w:shd w:val="clear" w:color="auto" w:fill="F3F6F9"/>
+            <w:tcMar>
+              <w:top w:w="60" w:type="dxa"/>
+              <w:left w:w="60" w:type="dxa"/>
+              <w:bottom w:w="60" w:type="dxa"/>
+              <w:right w:w="60" w:type="dxa"/>
+            </w:tcMar>
+          </w:tcPr>
+          <w:p>
+            <w:pPr>
+              <w:spacing w:before="20" w:after="20"/>
+            </w:pPr>
+            <w:r/>
+            <w:r>
+              <w:rPr>
+                <w:rFonts w:ascii="Calibri" w:hAnsi="Calibri" w:eastAsia="Calibri"/>
+                <w:b w:val="0"/>
+                <w:color w:val="1A1A1A"/>
+                <w:sz w:val="16"/>
+              </w:rPr>
+              <w:t>Plant 1010, as a customer</w:t>
+            </w:r>
+          </w:p>
+        </w:tc>
+        <w:tc>
+          <w:tcPr>
+            <w:tcW w:type="dxa" w:w="2606"/>
+            <w:shd w:val="clear" w:color="auto" w:fill="F3F6F9"/>
+            <w:tcMar>
+              <w:top w:w="60" w:type="dxa"/>
+              <w:left w:w="60" w:type="dxa"/>
+              <w:bottom w:w="60" w:type="dxa"/>
+              <w:right w:w="60" w:type="dxa"/>
+            </w:tcMar>
+          </w:tcPr>
+          <w:p>
+            <w:pPr>
+              <w:spacing w:before="20" w:after="20"/>
+            </w:pPr>
+            <w:r/>
+            <w:r>
+              <w:rPr>
+                <w:rFonts w:ascii="Calibri" w:hAnsi="Calibri" w:eastAsia="Calibri"/>
+                <w:b w:val="0"/>
+                <w:color w:val="1A1A1A"/>
+                <w:sz w:val="16"/>
+              </w:rPr>
+              <w:t>Customer general data, Plant 1010. This account had no open item for billing document 90005786.</w:t>
+            </w:r>
+          </w:p>
+        </w:tc>
+      </w:tr>
+    </w:tbl>
+    <w:p>
+      <w:pPr>
+        <w:spacing w:after="120"/>
+      </w:pPr>
+    </w:p>
+    <w:p>
+      <w:pPr>
+        <w:spacing w:after="160" w:before="0" w:line="259" w:lineRule="auto"/>
+      </w:pPr>
+      <w:r>
+        <w:rPr>
+          <w:rFonts w:ascii="Calibri" w:hAnsi="Calibri" w:eastAsia="Calibri"/>
+          <w:b w:val="0"/>
+          <w:color w:val="1A1A1A"/>
+          <w:sz w:val="22"/>
+        </w:rPr>
+        <w:t>BP1710 is the vendor that represents plant 1710. It does not represent company code 1710. Company code 1710 is vendor 0017401710. Customer 10401010 represents company code 1010. Customer 10411010 represents plant 1010.</w:t>
+      </w:r>
     </w:p>
     <w:p>
       <w:pPr>

</xml_diff>

<commit_message>
Document where a business partner is mapped to a plant or a company.
The plant is the Plant field, the company is the trading partner, and the shipping and intercompany customers are stored on the plant and the sales organization.

Co-authored-by: aleo25672 <aleo25672@users.noreply.github.com>
</commit_message>
<xml_diff>
--- a/docs/INTERCOMPANY_RESALE.docx
+++ b/docs/INTERCOMPANY_RESALE.docx
@@ -598,6 +598,750 @@
       <w:pPr>
         <w:spacing w:after="120"/>
       </w:pPr>
+    </w:p>
+    <w:p>
+      <w:pPr>
+        <w:pStyle w:val="Heading1"/>
+      </w:pPr>
+      <w:r>
+        <w:t>How a business partner maps to a plant or a company</w:t>
+      </w:r>
+    </w:p>
+    <w:p>
+      <w:pPr>
+        <w:spacing w:after="160" w:before="0" w:line="259" w:lineRule="auto"/>
+      </w:pPr>
+      <w:r>
+        <w:rPr>
+          <w:rFonts w:ascii="Calibri" w:hAnsi="Calibri" w:eastAsia="Calibri"/>
+          <w:b w:val="0"/>
+          <w:color w:val="1A1A1A"/>
+          <w:sz w:val="22"/>
+        </w:rPr>
+        <w:t>The business partner number does not say whether the partner is a plant or a company. The grouping only decides which number range is used. The map is stored in master-data fields and in two customizing tables.</w:t>
+      </w:r>
+    </w:p>
+    <w:tbl>
+      <w:tblPr>
+        <w:tblStyle w:val="TableGrid"/>
+        <w:tblW w:type="auto" w:w="0"/>
+        <w:jc w:val="center"/>
+        <w:tblLayout w:type="autofit"/>
+        <w:tblLook w:firstColumn="1" w:firstRow="1" w:lastColumn="0" w:lastRow="0" w:noHBand="0" w:noVBand="1" w:val="04A0"/>
+      </w:tblPr>
+      <w:tblGrid>
+        <w:gridCol w:w="3475"/>
+        <w:gridCol w:w="3475"/>
+        <w:gridCol w:w="3475"/>
+      </w:tblGrid>
+      <w:tr>
+        <w:trPr>
+          <w:tblHeader/>
+          <w:cantSplit/>
+        </w:trPr>
+        <w:tc>
+          <w:tcPr>
+            <w:tcW w:type="dxa" w:w="3475"/>
+            <w:shd w:val="clear" w:color="auto" w:fill="1F4E79"/>
+            <w:tcMar>
+              <w:top w:w="60" w:type="dxa"/>
+              <w:left w:w="60" w:type="dxa"/>
+              <w:bottom w:w="60" w:type="dxa"/>
+              <w:right w:w="60" w:type="dxa"/>
+            </w:tcMar>
+          </w:tcPr>
+          <w:p>
+            <w:pPr>
+              <w:spacing w:before="20" w:after="20"/>
+            </w:pPr>
+            <w:r/>
+            <w:r>
+              <w:rPr>
+                <w:rFonts w:ascii="Calibri" w:hAnsi="Calibri" w:eastAsia="Calibri"/>
+                <w:b/>
+                <w:color w:val="FFFFFF"/>
+                <w:sz w:val="16"/>
+              </w:rPr>
+              <w:t>Relationship</w:t>
+            </w:r>
+          </w:p>
+        </w:tc>
+        <w:tc>
+          <w:tcPr>
+            <w:tcW w:type="dxa" w:w="3475"/>
+            <w:shd w:val="clear" w:color="auto" w:fill="1F4E79"/>
+            <w:tcMar>
+              <w:top w:w="60" w:type="dxa"/>
+              <w:left w:w="60" w:type="dxa"/>
+              <w:bottom w:w="60" w:type="dxa"/>
+              <w:right w:w="60" w:type="dxa"/>
+            </w:tcMar>
+          </w:tcPr>
+          <w:p>
+            <w:pPr>
+              <w:spacing w:before="20" w:after="20"/>
+            </w:pPr>
+            <w:r/>
+            <w:r>
+              <w:rPr>
+                <w:rFonts w:ascii="Calibri" w:hAnsi="Calibri" w:eastAsia="Calibri"/>
+                <w:b/>
+                <w:color w:val="FFFFFF"/>
+                <w:sz w:val="16"/>
+              </w:rPr>
+              <w:t>Where it is stored</w:t>
+            </w:r>
+          </w:p>
+        </w:tc>
+        <w:tc>
+          <w:tcPr>
+            <w:tcW w:type="dxa" w:w="3475"/>
+            <w:shd w:val="clear" w:color="auto" w:fill="1F4E79"/>
+            <w:tcMar>
+              <w:top w:w="60" w:type="dxa"/>
+              <w:left w:w="60" w:type="dxa"/>
+              <w:bottom w:w="60" w:type="dxa"/>
+              <w:right w:w="60" w:type="dxa"/>
+            </w:tcMar>
+          </w:tcPr>
+          <w:p>
+            <w:pPr>
+              <w:spacing w:before="20" w:after="20"/>
+            </w:pPr>
+            <w:r/>
+            <w:r>
+              <w:rPr>
+                <w:rFonts w:ascii="Calibri" w:hAnsi="Calibri" w:eastAsia="Calibri"/>
+                <w:b/>
+                <w:color w:val="FFFFFF"/>
+                <w:sz w:val="16"/>
+              </w:rPr>
+              <w:t>Where you read it</w:t>
+            </w:r>
+          </w:p>
+        </w:tc>
+      </w:tr>
+      <w:tr>
+        <w:trPr>
+          <w:cantSplit/>
+        </w:trPr>
+        <w:tc>
+          <w:tcPr>
+            <w:tcW w:type="dxa" w:w="3475"/>
+            <w:shd w:val="clear" w:color="auto" w:fill="FFFFFF"/>
+            <w:tcMar>
+              <w:top w:w="60" w:type="dxa"/>
+              <w:left w:w="60" w:type="dxa"/>
+              <w:bottom w:w="60" w:type="dxa"/>
+              <w:right w:w="60" w:type="dxa"/>
+            </w:tcMar>
+          </w:tcPr>
+          <w:p>
+            <w:pPr>
+              <w:spacing w:before="20" w:after="20"/>
+            </w:pPr>
+            <w:r/>
+            <w:r>
+              <w:rPr>
+                <w:rFonts w:ascii="Calibri" w:hAnsi="Calibri" w:eastAsia="Calibri"/>
+                <w:b w:val="0"/>
+                <w:color w:val="1A1A1A"/>
+                <w:sz w:val="16"/>
+              </w:rPr>
+              <w:t>This supplier represents a plant</w:t>
+            </w:r>
+          </w:p>
+        </w:tc>
+        <w:tc>
+          <w:tcPr>
+            <w:tcW w:type="dxa" w:w="3475"/>
+            <w:shd w:val="clear" w:color="auto" w:fill="FFFFFF"/>
+            <w:tcMar>
+              <w:top w:w="60" w:type="dxa"/>
+              <w:left w:w="60" w:type="dxa"/>
+              <w:bottom w:w="60" w:type="dxa"/>
+              <w:right w:w="60" w:type="dxa"/>
+            </w:tcMar>
+          </w:tcPr>
+          <w:p>
+            <w:pPr>
+              <w:spacing w:before="20" w:after="20"/>
+            </w:pPr>
+            <w:r/>
+            <w:r>
+              <w:rPr>
+                <w:rFonts w:ascii="Calibri" w:hAnsi="Calibri" w:eastAsia="Calibri"/>
+                <w:b w:val="0"/>
+                <w:color w:val="1A1A1A"/>
+                <w:sz w:val="16"/>
+              </w:rPr>
+              <w:t>Supplier general data, field Plant (LFA1-WERKS). In the extract, SupplierPlant.</w:t>
+            </w:r>
+          </w:p>
+        </w:tc>
+        <w:tc>
+          <w:tcPr>
+            <w:tcW w:type="dxa" w:w="3475"/>
+            <w:shd w:val="clear" w:color="auto" w:fill="FFFFFF"/>
+            <w:tcMar>
+              <w:top w:w="60" w:type="dxa"/>
+              <w:left w:w="60" w:type="dxa"/>
+              <w:bottom w:w="60" w:type="dxa"/>
+              <w:right w:w="60" w:type="dxa"/>
+            </w:tcMar>
+          </w:tcPr>
+          <w:p>
+            <w:pPr>
+              <w:spacing w:before="20" w:after="20"/>
+            </w:pPr>
+            <w:r/>
+            <w:r>
+              <w:rPr>
+                <w:rFonts w:ascii="Calibri" w:hAnsi="Calibri" w:eastAsia="Calibri"/>
+                <w:b w:val="0"/>
+                <w:color w:val="1A1A1A"/>
+                <w:sz w:val="16"/>
+              </w:rPr>
+              <w:t>BP, role Supplier, Supplier: General Data, Plant</w:t>
+            </w:r>
+          </w:p>
+        </w:tc>
+      </w:tr>
+      <w:tr>
+        <w:trPr>
+          <w:cantSplit/>
+        </w:trPr>
+        <w:tc>
+          <w:tcPr>
+            <w:tcW w:type="dxa" w:w="3475"/>
+            <w:shd w:val="clear" w:color="auto" w:fill="F3F6F9"/>
+            <w:tcMar>
+              <w:top w:w="60" w:type="dxa"/>
+              <w:left w:w="60" w:type="dxa"/>
+              <w:bottom w:w="60" w:type="dxa"/>
+              <w:right w:w="60" w:type="dxa"/>
+            </w:tcMar>
+          </w:tcPr>
+          <w:p>
+            <w:pPr>
+              <w:spacing w:before="20" w:after="20"/>
+            </w:pPr>
+            <w:r/>
+            <w:r>
+              <w:rPr>
+                <w:rFonts w:ascii="Calibri" w:hAnsi="Calibri" w:eastAsia="Calibri"/>
+                <w:b w:val="0"/>
+                <w:color w:val="1A1A1A"/>
+                <w:sz w:val="16"/>
+              </w:rPr>
+              <w:t>This customer represents a plant</w:t>
+            </w:r>
+          </w:p>
+        </w:tc>
+        <w:tc>
+          <w:tcPr>
+            <w:tcW w:type="dxa" w:w="3475"/>
+            <w:shd w:val="clear" w:color="auto" w:fill="F3F6F9"/>
+            <w:tcMar>
+              <w:top w:w="60" w:type="dxa"/>
+              <w:left w:w="60" w:type="dxa"/>
+              <w:bottom w:w="60" w:type="dxa"/>
+              <w:right w:w="60" w:type="dxa"/>
+            </w:tcMar>
+          </w:tcPr>
+          <w:p>
+            <w:pPr>
+              <w:spacing w:before="20" w:after="20"/>
+            </w:pPr>
+            <w:r/>
+            <w:r>
+              <w:rPr>
+                <w:rFonts w:ascii="Calibri" w:hAnsi="Calibri" w:eastAsia="Calibri"/>
+                <w:b w:val="0"/>
+                <w:color w:val="1A1A1A"/>
+                <w:sz w:val="16"/>
+              </w:rPr>
+              <w:t>Customer general data, field Plant (KNA1-WERKS).</w:t>
+            </w:r>
+          </w:p>
+        </w:tc>
+        <w:tc>
+          <w:tcPr>
+            <w:tcW w:type="dxa" w:w="3475"/>
+            <w:shd w:val="clear" w:color="auto" w:fill="F3F6F9"/>
+            <w:tcMar>
+              <w:top w:w="60" w:type="dxa"/>
+              <w:left w:w="60" w:type="dxa"/>
+              <w:bottom w:w="60" w:type="dxa"/>
+              <w:right w:w="60" w:type="dxa"/>
+            </w:tcMar>
+          </w:tcPr>
+          <w:p>
+            <w:pPr>
+              <w:spacing w:before="20" w:after="20"/>
+            </w:pPr>
+            <w:r/>
+            <w:r>
+              <w:rPr>
+                <w:rFonts w:ascii="Calibri" w:hAnsi="Calibri" w:eastAsia="Calibri"/>
+                <w:b w:val="0"/>
+                <w:color w:val="1A1A1A"/>
+                <w:sz w:val="16"/>
+              </w:rPr>
+              <w:t>BP, role Customer, Customer: General Data, Plant</w:t>
+            </w:r>
+          </w:p>
+        </w:tc>
+      </w:tr>
+      <w:tr>
+        <w:trPr>
+          <w:cantSplit/>
+        </w:trPr>
+        <w:tc>
+          <w:tcPr>
+            <w:tcW w:type="dxa" w:w="3475"/>
+            <w:shd w:val="clear" w:color="auto" w:fill="FFFFFF"/>
+            <w:tcMar>
+              <w:top w:w="60" w:type="dxa"/>
+              <w:left w:w="60" w:type="dxa"/>
+              <w:bottom w:w="60" w:type="dxa"/>
+              <w:right w:w="60" w:type="dxa"/>
+            </w:tcMar>
+          </w:tcPr>
+          <w:p>
+            <w:pPr>
+              <w:spacing w:before="20" w:after="20"/>
+            </w:pPr>
+            <w:r/>
+            <w:r>
+              <w:rPr>
+                <w:rFonts w:ascii="Calibri" w:hAnsi="Calibri" w:eastAsia="Calibri"/>
+                <w:b w:val="0"/>
+                <w:color w:val="1A1A1A"/>
+                <w:sz w:val="16"/>
+              </w:rPr>
+              <w:t>This partner represents a company</w:t>
+            </w:r>
+          </w:p>
+        </w:tc>
+        <w:tc>
+          <w:tcPr>
+            <w:tcW w:type="dxa" w:w="3475"/>
+            <w:shd w:val="clear" w:color="auto" w:fill="FFFFFF"/>
+            <w:tcMar>
+              <w:top w:w="60" w:type="dxa"/>
+              <w:left w:w="60" w:type="dxa"/>
+              <w:bottom w:w="60" w:type="dxa"/>
+              <w:right w:w="60" w:type="dxa"/>
+            </w:tcMar>
+          </w:tcPr>
+          <w:p>
+            <w:pPr>
+              <w:spacing w:before="20" w:after="20"/>
+            </w:pPr>
+            <w:r/>
+            <w:r>
+              <w:rPr>
+                <w:rFonts w:ascii="Calibri" w:hAnsi="Calibri" w:eastAsia="Calibri"/>
+                <w:b w:val="0"/>
+                <w:color w:val="1A1A1A"/>
+                <w:sz w:val="16"/>
+              </w:rPr>
+              <w:t>Trading partner on the supplier or the customer (LFA1-VBUND, KNA1-VBUND).</w:t>
+            </w:r>
+          </w:p>
+        </w:tc>
+        <w:tc>
+          <w:tcPr>
+            <w:tcW w:type="dxa" w:w="3475"/>
+            <w:shd w:val="clear" w:color="auto" w:fill="FFFFFF"/>
+            <w:tcMar>
+              <w:top w:w="60" w:type="dxa"/>
+              <w:left w:w="60" w:type="dxa"/>
+              <w:bottom w:w="60" w:type="dxa"/>
+              <w:right w:w="60" w:type="dxa"/>
+            </w:tcMar>
+          </w:tcPr>
+          <w:p>
+            <w:pPr>
+              <w:spacing w:before="20" w:after="20"/>
+            </w:pPr>
+            <w:r/>
+            <w:r>
+              <w:rPr>
+                <w:rFonts w:ascii="Calibri" w:hAnsi="Calibri" w:eastAsia="Calibri"/>
+                <w:b w:val="0"/>
+                <w:color w:val="1A1A1A"/>
+                <w:sz w:val="16"/>
+              </w:rPr>
+              <w:t>BP, Control, Trading Partner</w:t>
+            </w:r>
+          </w:p>
+        </w:tc>
+      </w:tr>
+      <w:tr>
+        <w:trPr>
+          <w:cantSplit/>
+        </w:trPr>
+        <w:tc>
+          <w:tcPr>
+            <w:tcW w:type="dxa" w:w="3475"/>
+            <w:shd w:val="clear" w:color="auto" w:fill="F3F6F9"/>
+            <w:tcMar>
+              <w:top w:w="60" w:type="dxa"/>
+              <w:left w:w="60" w:type="dxa"/>
+              <w:bottom w:w="60" w:type="dxa"/>
+              <w:right w:w="60" w:type="dxa"/>
+            </w:tcMar>
+          </w:tcPr>
+          <w:p>
+            <w:pPr>
+              <w:spacing w:before="20" w:after="20"/>
+            </w:pPr>
+            <w:r/>
+            <w:r>
+              <w:rPr>
+                <w:rFonts w:ascii="Calibri" w:hAnsi="Calibri" w:eastAsia="Calibri"/>
+                <w:b w:val="0"/>
+                <w:color w:val="1A1A1A"/>
+                <w:sz w:val="16"/>
+              </w:rPr>
+              <w:t>The company code of a plant</w:t>
+            </w:r>
+          </w:p>
+        </w:tc>
+        <w:tc>
+          <w:tcPr>
+            <w:tcW w:type="dxa" w:w="3475"/>
+            <w:shd w:val="clear" w:color="auto" w:fill="F3F6F9"/>
+            <w:tcMar>
+              <w:top w:w="60" w:type="dxa"/>
+              <w:left w:w="60" w:type="dxa"/>
+              <w:bottom w:w="60" w:type="dxa"/>
+              <w:right w:w="60" w:type="dxa"/>
+            </w:tcMar>
+          </w:tcPr>
+          <w:p>
+            <w:pPr>
+              <w:spacing w:before="20" w:after="20"/>
+            </w:pPr>
+            <w:r/>
+            <w:r>
+              <w:rPr>
+                <w:rFonts w:ascii="Calibri" w:hAnsi="Calibri" w:eastAsia="Calibri"/>
+                <w:b w:val="0"/>
+                <w:color w:val="1A1A1A"/>
+                <w:sz w:val="16"/>
+              </w:rPr>
+              <w:t>The plant's valuation area (T001W-BWKEY) and that area's company code (T001K-BUKRS).</w:t>
+            </w:r>
+          </w:p>
+        </w:tc>
+        <w:tc>
+          <w:tcPr>
+            <w:tcW w:type="dxa" w:w="3475"/>
+            <w:shd w:val="clear" w:color="auto" w:fill="F3F6F9"/>
+            <w:tcMar>
+              <w:top w:w="60" w:type="dxa"/>
+              <w:left w:w="60" w:type="dxa"/>
+              <w:bottom w:w="60" w:type="dxa"/>
+              <w:right w:w="60" w:type="dxa"/>
+            </w:tcMar>
+          </w:tcPr>
+          <w:p>
+            <w:pPr>
+              <w:spacing w:before="20" w:after="20"/>
+            </w:pPr>
+            <w:r/>
+            <w:r>
+              <w:rPr>
+                <w:rFonts w:ascii="Calibri" w:hAnsi="Calibri" w:eastAsia="Calibri"/>
+                <w:b w:val="0"/>
+                <w:color w:val="1A1A1A"/>
+                <w:sz w:val="16"/>
+              </w:rPr>
+              <w:t>Plant customizing, assign plant to company code</w:t>
+            </w:r>
+          </w:p>
+        </w:tc>
+      </w:tr>
+      <w:tr>
+        <w:trPr>
+          <w:cantSplit/>
+        </w:trPr>
+        <w:tc>
+          <w:tcPr>
+            <w:tcW w:type="dxa" w:w="3475"/>
+            <w:shd w:val="clear" w:color="auto" w:fill="FFFFFF"/>
+            <w:tcMar>
+              <w:top w:w="60" w:type="dxa"/>
+              <w:left w:w="60" w:type="dxa"/>
+              <w:bottom w:w="60" w:type="dxa"/>
+              <w:right w:w="60" w:type="dxa"/>
+            </w:tcMar>
+          </w:tcPr>
+          <w:p>
+            <w:pPr>
+              <w:spacing w:before="20" w:after="20"/>
+            </w:pPr>
+            <w:r/>
+            <w:r>
+              <w:rPr>
+                <w:rFonts w:ascii="Calibri" w:hAnsi="Calibri" w:eastAsia="Calibri"/>
+                <w:b w:val="0"/>
+                <w:color w:val="1A1A1A"/>
+                <w:sz w:val="16"/>
+              </w:rPr>
+              <w:t>Companies that can post to this partner</w:t>
+            </w:r>
+          </w:p>
+        </w:tc>
+        <w:tc>
+          <w:tcPr>
+            <w:tcW w:type="dxa" w:w="3475"/>
+            <w:shd w:val="clear" w:color="auto" w:fill="FFFFFF"/>
+            <w:tcMar>
+              <w:top w:w="60" w:type="dxa"/>
+              <w:left w:w="60" w:type="dxa"/>
+              <w:bottom w:w="60" w:type="dxa"/>
+              <w:right w:w="60" w:type="dxa"/>
+            </w:tcMar>
+          </w:tcPr>
+          <w:p>
+            <w:pPr>
+              <w:spacing w:before="20" w:after="20"/>
+            </w:pPr>
+            <w:r/>
+            <w:r>
+              <w:rPr>
+                <w:rFonts w:ascii="Calibri" w:hAnsi="Calibri" w:eastAsia="Calibri"/>
+                <w:b w:val="0"/>
+                <w:color w:val="1A1A1A"/>
+                <w:sz w:val="16"/>
+              </w:rPr>
+              <w:t>Supplier company code (LFB1) and customer company code (KNB1).</w:t>
+            </w:r>
+          </w:p>
+        </w:tc>
+        <w:tc>
+          <w:tcPr>
+            <w:tcW w:type="dxa" w:w="3475"/>
+            <w:shd w:val="clear" w:color="auto" w:fill="FFFFFF"/>
+            <w:tcMar>
+              <w:top w:w="60" w:type="dxa"/>
+              <w:left w:w="60" w:type="dxa"/>
+              <w:bottom w:w="60" w:type="dxa"/>
+              <w:right w:w="60" w:type="dxa"/>
+            </w:tcMar>
+          </w:tcPr>
+          <w:p>
+            <w:pPr>
+              <w:spacing w:before="20" w:after="20"/>
+            </w:pPr>
+            <w:r/>
+            <w:r>
+              <w:rPr>
+                <w:rFonts w:ascii="Calibri" w:hAnsi="Calibri" w:eastAsia="Calibri"/>
+                <w:b w:val="0"/>
+                <w:color w:val="1A1A1A"/>
+                <w:sz w:val="16"/>
+              </w:rPr>
+              <w:t>BP, Supplier (Fin. Accounting) or FI Customer, Company Code</w:t>
+            </w:r>
+          </w:p>
+        </w:tc>
+      </w:tr>
+      <w:tr>
+        <w:trPr>
+          <w:cantSplit/>
+        </w:trPr>
+        <w:tc>
+          <w:tcPr>
+            <w:tcW w:type="dxa" w:w="3475"/>
+            <w:shd w:val="clear" w:color="auto" w:fill="F3F6F9"/>
+            <w:tcMar>
+              <w:top w:w="60" w:type="dxa"/>
+              <w:left w:w="60" w:type="dxa"/>
+              <w:bottom w:w="60" w:type="dxa"/>
+              <w:right w:w="60" w:type="dxa"/>
+            </w:tcMar>
+          </w:tcPr>
+          <w:p>
+            <w:pPr>
+              <w:spacing w:before="20" w:after="20"/>
+            </w:pPr>
+            <w:r/>
+            <w:r>
+              <w:rPr>
+                <w:rFonts w:ascii="Calibri" w:hAnsi="Calibri" w:eastAsia="Calibri"/>
+                <w:b w:val="0"/>
+                <w:color w:val="1A1A1A"/>
+                <w:sz w:val="16"/>
+              </w:rPr>
+              <w:t>Customer used when another plant ships to this plant</w:t>
+            </w:r>
+          </w:p>
+        </w:tc>
+        <w:tc>
+          <w:tcPr>
+            <w:tcW w:type="dxa" w:w="3475"/>
+            <w:shd w:val="clear" w:color="auto" w:fill="F3F6F9"/>
+            <w:tcMar>
+              <w:top w:w="60" w:type="dxa"/>
+              <w:left w:w="60" w:type="dxa"/>
+              <w:bottom w:w="60" w:type="dxa"/>
+              <w:right w:w="60" w:type="dxa"/>
+            </w:tcMar>
+          </w:tcPr>
+          <w:p>
+            <w:pPr>
+              <w:spacing w:before="20" w:after="20"/>
+            </w:pPr>
+            <w:r/>
+            <w:r>
+              <w:rPr>
+                <w:rFonts w:ascii="Calibri" w:hAnsi="Calibri" w:eastAsia="Calibri"/>
+                <w:b w:val="0"/>
+                <w:color w:val="1A1A1A"/>
+                <w:sz w:val="16"/>
+              </w:rPr>
+              <w:t>Customer number of the plant (T001W-KUNNR). The plant's sales area is T001W-VKORG, VTWEG, and SPART.</w:t>
+            </w:r>
+          </w:p>
+        </w:tc>
+        <w:tc>
+          <w:tcPr>
+            <w:tcW w:type="dxa" w:w="3475"/>
+            <w:shd w:val="clear" w:color="auto" w:fill="F3F6F9"/>
+            <w:tcMar>
+              <w:top w:w="60" w:type="dxa"/>
+              <w:left w:w="60" w:type="dxa"/>
+              <w:bottom w:w="60" w:type="dxa"/>
+              <w:right w:w="60" w:type="dxa"/>
+            </w:tcMar>
+          </w:tcPr>
+          <w:p>
+            <w:pPr>
+              <w:spacing w:before="20" w:after="20"/>
+            </w:pPr>
+            <w:r/>
+            <w:r>
+              <w:rPr>
+                <w:rFonts w:ascii="Calibri" w:hAnsi="Calibri" w:eastAsia="Calibri"/>
+                <w:b w:val="0"/>
+                <w:color w:val="1A1A1A"/>
+                <w:sz w:val="16"/>
+              </w:rPr>
+              <w:t>SPRO, Set up Stock Transport Order, Define Shipping Data for Plants</w:t>
+            </w:r>
+          </w:p>
+        </w:tc>
+      </w:tr>
+      <w:tr>
+        <w:trPr>
+          <w:cantSplit/>
+        </w:trPr>
+        <w:tc>
+          <w:tcPr>
+            <w:tcW w:type="dxa" w:w="3475"/>
+            <w:shd w:val="clear" w:color="auto" w:fill="FFFFFF"/>
+            <w:tcMar>
+              <w:top w:w="60" w:type="dxa"/>
+              <w:left w:w="60" w:type="dxa"/>
+              <w:bottom w:w="60" w:type="dxa"/>
+              <w:right w:w="60" w:type="dxa"/>
+            </w:tcMar>
+          </w:tcPr>
+          <w:p>
+            <w:pPr>
+              <w:spacing w:before="20" w:after="20"/>
+            </w:pPr>
+            <w:r/>
+            <w:r>
+              <w:rPr>
+                <w:rFonts w:ascii="Calibri" w:hAnsi="Calibri" w:eastAsia="Calibri"/>
+                <w:b w:val="0"/>
+                <w:color w:val="1A1A1A"/>
+                <w:sz w:val="16"/>
+              </w:rPr>
+              <w:t>Customer invoiced when another company ships for this sales organization</w:t>
+            </w:r>
+          </w:p>
+        </w:tc>
+        <w:tc>
+          <w:tcPr>
+            <w:tcW w:type="dxa" w:w="3475"/>
+            <w:shd w:val="clear" w:color="auto" w:fill="FFFFFF"/>
+            <w:tcMar>
+              <w:top w:w="60" w:type="dxa"/>
+              <w:left w:w="60" w:type="dxa"/>
+              <w:bottom w:w="60" w:type="dxa"/>
+              <w:right w:w="60" w:type="dxa"/>
+            </w:tcMar>
+          </w:tcPr>
+          <w:p>
+            <w:pPr>
+              <w:spacing w:before="20" w:after="20"/>
+            </w:pPr>
+            <w:r/>
+            <w:r>
+              <w:rPr>
+                <w:rFonts w:ascii="Calibri" w:hAnsi="Calibri" w:eastAsia="Calibri"/>
+                <w:b w:val="0"/>
+                <w:color w:val="1A1A1A"/>
+                <w:sz w:val="16"/>
+              </w:rPr>
+              <w:t>Internal customer of the sales organization (TVKO-KUNNR).</w:t>
+            </w:r>
+          </w:p>
+        </w:tc>
+        <w:tc>
+          <w:tcPr>
+            <w:tcW w:type="dxa" w:w="3475"/>
+            <w:shd w:val="clear" w:color="auto" w:fill="FFFFFF"/>
+            <w:tcMar>
+              <w:top w:w="60" w:type="dxa"/>
+              <w:left w:w="60" w:type="dxa"/>
+              <w:bottom w:w="60" w:type="dxa"/>
+              <w:right w:w="60" w:type="dxa"/>
+            </w:tcMar>
+          </w:tcPr>
+          <w:p>
+            <w:pPr>
+              <w:spacing w:before="20" w:after="20"/>
+            </w:pPr>
+            <w:r/>
+            <w:r>
+              <w:rPr>
+                <w:rFonts w:ascii="Calibri" w:hAnsi="Calibri" w:eastAsia="Calibri"/>
+                <w:b w:val="0"/>
+                <w:color w:val="1A1A1A"/>
+                <w:sz w:val="16"/>
+              </w:rPr>
+              <w:t>SPRO, Billing, Intercompany Billing, Define Internal Customer Number by Sales Organization</w:t>
+            </w:r>
+          </w:p>
+        </w:tc>
+      </w:tr>
+    </w:tbl>
+    <w:p>
+      <w:pPr>
+        <w:spacing w:after="120"/>
+      </w:pPr>
+    </w:p>
+    <w:p>
+      <w:pPr>
+        <w:spacing w:after="160" w:before="0" w:line="259" w:lineRule="auto"/>
+      </w:pPr>
+      <w:r>
+        <w:rPr>
+          <w:rFonts w:ascii="Calibri" w:hAnsi="Calibri" w:eastAsia="Calibri"/>
+          <w:b w:val="0"/>
+          <w:color w:val="1A1A1A"/>
+          <w:sz w:val="22"/>
+        </w:rPr>
+        <w:t>A company code on the financial view means that company can post to the partner. It does not mean the partner represents that company. The company the partner represents is the trading partner. The plant the partner represents is the Plant field. From the plant, the company code follows the valuation area.</w:t>
+      </w:r>
     </w:p>
     <w:p>
       <w:pPr>

</xml_diff>